<commit_message>
Cantumkan version DOI Zenodo v1.3.0 pada naskah JAIC
Rilis v1.3.0 terarsip di Zenodo pada 4 September 2026 dengan DOI
10.5281/zenodo.22291896. Pernyataan Data Availability kini menyebut version DOI
itu berdampingan dengan concept DOI, disertai alasan mengapa pembaca yang
mereplikasi hasil sebaiknya mengutip version DOI: concept DOI akan berpindah ke
versi yang lebih baru setiap kali deposit berikutnya dibuat, sehingga tidak
menunjuk revisi yang menghasilkan angka pada naskah ini.

Rujukan [48] disesuaikan mengikuti version DOI beserta tanggal rilisnya.

Co-Authored-By: Claude Opus 5 <noreply@anthropic.com>
</commit_message>
<xml_diff>
--- a/dokumen/JAIC_Multi-Scenario_Security_Evaluation_RSA-PSS_QR_Code_v2_n26.docx
+++ b/dokumen/JAIC_Multi-Scenario_Security_Evaluation_RSA-PSS_QR_Code_v2_n26.docx
@@ -15019,7 +15019,7 @@
         <w:jc w:val="both"/>
       </w:pPr>
       <w:r>
-        <w:t xml:space="preserve">Every figure in this paper can be recomputed from archived material. The software, the measurement harness and the complete datasets are deposited in a single Zenodo record under the MIT licence, citable through the concept DOI 10.5281/zenodo.21271011, which always resolves to the most recent version [48]. The deposit contains the calibrated simulation dataset of 350,000 operations exported from the test database and verified identical to its source across 461,950 values; the empirical measurement package of 66,500 operations reported in Section III.F, comprising the raw JSON output, three derived CSV summaries and a SHA-256 manifest; and the external HTTP load measurements of Section III.G. The two harnesses are included as runnable scripts, and the empirical campaign is deterministic: re-executing it with the recorded seed on the same revision reproduces the reported counts exactly. Only the timing statistics vary between runs, since they are measured against wall-clock time.</w:t>
+        <w:t xml:space="preserve">Every figure in this paper can be recomputed from archived material. The software, the measurement harness and the complete datasets are deposited in a single Zenodo record under the MIT licence, citable through the concept DOI 10.5281/zenodo.21271011, which always resolves to the most recent version. The exact release underlying this paper is version 1.3.0, DOI 10.5281/zenodo.22291896 [48]; readers reproducing these results should cite the version DOI rather than the concept DOI, because the concept DOI will move as later versions are deposited. The deposit contains the calibrated simulation dataset of 350,000 operations exported from the test database and verified identical to its source across 461,950 values; the empirical measurement package of 66,500 operations reported in Section III.F, comprising the raw JSON output, three derived CSV summaries and a SHA-256 manifest; and the external HTTP load measurements of Section III.G. The two harnesses are included as runnable scripts, and the empirical campaign is deterministic: re-executing it with the recorded seed on the same revision reproduces the reported counts exactly. Only the timing statistics vary between runs, since they are measured against wall-clock time.</w:t>
       </w:r>
     </w:p>
     <w:p>
@@ -16745,7 +16745,7 @@
           <w:sz w:val="16"/>
           <w:szCs w:val="16"/>
         </w:rPr>
-        <w:t xml:space="preserve">[48]A. A. Slameto, Y. Sutanto, and H. Kurniawan, “QR Code Security System RSA-PSS: software, measurement harnesses and evaluation datasets,” Zenodo, 2026. DOI: https://doi.org/10.5281/zenodo.21271011</w:t>
+        <w:t xml:space="preserve">[48]A. A. Slameto, Y. Sutanto, and H. Kurniawan, “QR Code Security System RSA-PSS: software, measurement harnesses and evaluation datasets,” version 1.3.0, Zenodo, 4 Sep. 2026. DOI: https://doi.org/10.5281/zenodo.22291896</w:t>
       </w:r>
     </w:p>
     <w:sectPr>

</xml_diff>

<commit_message>
Arahkan rujukan DOI ke rilis v1.3.1 yang memuat perangkat uji beban
Rilis v1.3.1 terarsip di Zenodo pada 4 September 2026 dengan DOI
10.5281/zenodo.22292443. Berbeda dari v1.3.0, rilis ini memuat perangkat uji
beban sehingga pembaca yang mengunduhnya benar-benar dapat mereproduksi seluruh
hasil pada naskah, bukan hanya pengukuran empiris.

Naskah JAIC dan Laporan Akhir kini menunjuk version DOI tersebut. Concept DOI
tetap disebut pada naskah sebagai penunjuk versi terkini, dengan penjelasan
bahwa replikasi sebaiknya memakai version DOI karena concept DOI akan berpindah
pada deposit berikutnya.

Co-Authored-By: Claude Opus 5 <noreply@anthropic.com>
</commit_message>
<xml_diff>
--- a/dokumen/JAIC_Multi-Scenario_Security_Evaluation_RSA-PSS_QR_Code_v2_n26.docx
+++ b/dokumen/JAIC_Multi-Scenario_Security_Evaluation_RSA-PSS_QR_Code_v2_n26.docx
@@ -15019,7 +15019,7 @@
         <w:jc w:val="both"/>
       </w:pPr>
       <w:r>
-        <w:t xml:space="preserve">Every figure in this paper can be recomputed from archived material. The software, the measurement harness and the complete datasets are deposited in a single Zenodo record under the MIT licence, citable through the concept DOI 10.5281/zenodo.21271011, which always resolves to the most recent version. The exact release underlying this paper is version 1.3.0, DOI 10.5281/zenodo.22291896 [48]; readers reproducing these results should cite the version DOI rather than the concept DOI, because the concept DOI will move as later versions are deposited. The deposit contains the calibrated simulation dataset of 350,000 operations exported from the test database and verified identical to its source across 461,950 values; the empirical measurement package of 66,500 operations reported in Section III.F, comprising the raw JSON output, three derived CSV summaries and a SHA-256 manifest; and the external HTTP load measurements of Section III.G. The two harnesses are included as runnable scripts, and the empirical campaign is deterministic: re-executing it with the recorded seed on the same revision reproduces the reported counts exactly. Only the timing statistics vary between runs, since they are measured against wall-clock time.</w:t>
+        <w:t xml:space="preserve">Every figure in this paper can be recomputed from archived material. The software, the measurement harness and the complete datasets are deposited in a single Zenodo record under the MIT licence, citable through the concept DOI 10.5281/zenodo.21271011, which always resolves to the most recent version. The exact release underlying this paper is version 1.3.1, DOI 10.5281/zenodo.22292443 [48]; readers reproducing these results should cite the version DOI rather than the concept DOI, because the concept DOI will move as later versions are deposited. The deposit contains the calibrated simulation dataset of 350,000 operations exported from the test database and verified identical to its source across 461,950 values; the empirical measurement package of 66,500 operations reported in Section III.F, comprising the raw JSON output, three derived CSV summaries and a SHA-256 manifest; and the external HTTP load measurements of Section III.G. The two harnesses are included as runnable scripts, and the empirical campaign is deterministic: re-executing it with the recorded seed on the same revision reproduces the reported counts exactly. Only the timing statistics vary between runs, since they are measured against wall-clock time.</w:t>
       </w:r>
     </w:p>
     <w:p>
@@ -16745,7 +16745,7 @@
           <w:sz w:val="16"/>
           <w:szCs w:val="16"/>
         </w:rPr>
-        <w:t xml:space="preserve">[48]A. A. Slameto, Y. Sutanto, and H. Kurniawan, “QR Code Security System RSA-PSS: software, measurement harnesses and evaluation datasets,” version 1.3.0, Zenodo, 4 Sep. 2026. DOI: https://doi.org/10.5281/zenodo.22291896</w:t>
+        <w:t xml:space="preserve">[48]A. A. Slameto, Y. Sutanto, and H. Kurniawan, “QR Code Security System RSA-PSS: software, measurement harnesses and evaluation datasets,” version 1.3.1, Zenodo, 4 Sep. 2026. DOI: https://doi.org/10.5281/zenodo.22292443</w:t>
       </w:r>
     </w:p>
     <w:sectPr>

</xml_diff>